<commit_message>
docs: Pravin Game as guide, expand references to 25
Co-Authored-By: Claude Sonnet 5.5 <noreply@anthropic.com>
</commit_message>
<xml_diff>
--- a/paper/Adaptive_LOD_Research_Paper_IEEE.docx
+++ b/paper/Adaptive_LOD_Research_Paper_IEEE.docx
@@ -29,14 +29,13 @@
         </w:tblBorders>
       </w:tblPr>
       <w:tblGrid>
-        <w:gridCol w:w="3480"/>
-        <w:gridCol w:w="3480"/>
-        <w:gridCol w:w="3480"/>
+        <w:gridCol w:w="5220"/>
+        <w:gridCol w:w="5220"/>
       </w:tblGrid>
       <w:tr>
         <w:tc>
           <w:tcPr>
-            <w:tcW w:type="dxa" w:w="3480"/>
+            <w:tcW w:type="dxa" w:w="5220"/>
             <w:tcBorders>
               <w:top w:val="none" w:color="FFFFFF" w:sz="0"/>
               <w:left w:val="none" w:color="FFFFFF" w:sz="0"/>
@@ -61,7 +60,7 @@
                 <w:sz w:val="22"/>
                 <w:szCs w:val="22"/>
               </w:rPr>
-              <w:t xml:space="preserve">Pravin Game</w:t>
+              <w:t xml:space="preserve">Shreeniwas Salian</w:t>
             </w:r>
           </w:p>
           <w:p>
@@ -99,7 +98,7 @@
         </w:tc>
         <w:tc>
           <w:tcPr>
-            <w:tcW w:type="dxa" w:w="3480"/>
+            <w:tcW w:type="dxa" w:w="5220"/>
             <w:tcBorders>
               <w:top w:val="none" w:color="FFFFFF" w:sz="0"/>
               <w:left w:val="none" w:color="FFFFFF" w:sz="0"/>
@@ -124,7 +123,7 @@
                 <w:sz w:val="22"/>
                 <w:szCs w:val="22"/>
               </w:rPr>
-              <w:t xml:space="preserve">Shreeniwas Salian</w:t>
+              <w:t xml:space="preserve">Koustubh Tayade</w:t>
             </w:r>
           </w:p>
           <w:p>
@@ -160,71 +159,48 @@
             </w:r>
           </w:p>
         </w:tc>
-        <w:tc>
-          <w:tcPr>
-            <w:tcW w:type="dxa" w:w="3480"/>
-            <w:tcBorders>
-              <w:top w:val="none" w:color="FFFFFF" w:sz="0"/>
-              <w:left w:val="none" w:color="FFFFFF" w:sz="0"/>
-              <w:bottom w:val="none" w:color="FFFFFF" w:sz="0"/>
-              <w:right w:val="none" w:color="FFFFFF" w:sz="0"/>
-            </w:tcBorders>
-            <w:tcMar>
-              <w:top w:type="dxa" w:w="0"/>
-              <w:left w:type="dxa" w:w="60"/>
-              <w:bottom w:type="dxa" w:w="0"/>
-              <w:right w:type="dxa" w:w="60"/>
-            </w:tcMar>
-          </w:tcPr>
-          <w:p>
-            <w:pPr>
-              <w:spacing w:after="0"/>
-              <w:jc w:val="center"/>
-            </w:pPr>
-            <w:r>
-              <w:rPr>
-                <w:rFonts w:ascii="Times New Roman" w:cs="Times New Roman" w:eastAsia="Times New Roman" w:hAnsi="Times New Roman"/>
-                <w:sz w:val="22"/>
-                <w:szCs w:val="22"/>
-              </w:rPr>
-              <w:t xml:space="preserve">Koustubh Tayade</w:t>
-            </w:r>
-          </w:p>
-          <w:p>
-            <w:pPr>
-              <w:spacing w:after="0"/>
-              <w:jc w:val="center"/>
-            </w:pPr>
-            <w:r>
-              <w:rPr>
-                <w:rFonts w:ascii="Times New Roman" w:cs="Times New Roman" w:eastAsia="Times New Roman" w:hAnsi="Times New Roman"/>
-                <w:i/>
-                <w:iCs/>
-                <w:sz w:val="18"/>
-                <w:szCs w:val="18"/>
-              </w:rPr>
-              <w:t xml:space="preserve">Department of Computer Engineering</w:t>
-            </w:r>
-          </w:p>
-          <w:p>
-            <w:pPr>
-              <w:spacing w:after="0"/>
-              <w:jc w:val="center"/>
-            </w:pPr>
-            <w:r>
-              <w:rPr>
-                <w:rFonts w:ascii="Times New Roman" w:cs="Times New Roman" w:eastAsia="Times New Roman" w:hAnsi="Times New Roman"/>
-                <w:i/>
-                <w:iCs/>
-                <w:sz w:val="18"/>
-                <w:szCs w:val="18"/>
-              </w:rPr>
-              <w:t xml:space="preserve">Pimpri Chinchwad College of Engineering</w:t>
-            </w:r>
-          </w:p>
-        </w:tc>
       </w:tr>
     </w:tbl>
+    <w:p>
+      <w:pPr>
+        <w:spacing w:after="0" w:before="100"/>
+        <w:jc w:val="center"/>
+      </w:pPr>
+      <w:r>
+        <w:rPr>
+          <w:rFonts w:ascii="Times New Roman" w:cs="Times New Roman" w:eastAsia="Times New Roman" w:hAnsi="Times New Roman"/>
+          <w:b/>
+          <w:bCs/>
+          <w:sz w:val="20"/>
+          <w:szCs w:val="20"/>
+        </w:rPr>
+        <w:t xml:space="preserve">Guide: </w:t>
+      </w:r>
+      <w:r>
+        <w:rPr>
+          <w:rFonts w:ascii="Times New Roman" w:cs="Times New Roman" w:eastAsia="Times New Roman" w:hAnsi="Times New Roman"/>
+          <w:sz w:val="22"/>
+          <w:szCs w:val="22"/>
+        </w:rPr>
+        <w:t xml:space="preserve">Pravin Game</w:t>
+      </w:r>
+    </w:p>
+    <w:p>
+      <w:pPr>
+        <w:spacing w:after="0"/>
+        <w:jc w:val="center"/>
+      </w:pPr>
+      <w:r>
+        <w:rPr>
+          <w:rFonts w:ascii="Times New Roman" w:cs="Times New Roman" w:eastAsia="Times New Roman" w:hAnsi="Times New Roman"/>
+          <w:i/>
+          <w:iCs/>
+          <w:sz w:val="18"/>
+          <w:szCs w:val="18"/>
+        </w:rPr>
+        <w:t xml:space="preserve">Department of Computer Engineering, Pimpri Chinchwad College of Engineering</w:t>
+      </w:r>
+    </w:p>
     <w:p>
       <w:pPr>
         <w:spacing w:after="160"/>
@@ -324,7 +300,7 @@
           <w:sz w:val="20"/>
           <w:szCs w:val="20"/>
         </w:rPr>
-        <w:t xml:space="preserve">Dense vegetation is one of the costliest parts of an outdoor real-time scene: thousands of trees and hundreds of thousands of grass clumps multiply triangle counts, draw calls and overdraw. Level of detail (LOD) reduces this cost by drawing simpler representations of distant objects [1], [2]. Most engines, including Godot, expose LOD as fixed distances chosen by an artist. Fixed distances cannot react to the frame budget: on a fast GPU they discard detail that would have been affordable, and on a slow GPU they keep detail that makes the frame miss its target.</w:t>
+        <w:t xml:space="preserve">Dense vegetation is one of the costliest parts of an outdoor real-time scene: thousands of trees and hundreds of thousands of grass clumps multiply triangle counts, draw calls and overdraw. Level of detail (LOD) reduces this cost by drawing simpler representations of distant objects [1]–[4]. The simpler representations come from mesh simplification [5]–[7]; vegetation is usually handled with instancing, billboards and density thinning [8]–[12]; terrain has its own continuous LOD [13]; and recent engines virtualize geometry [14]. Most engines, including Godot, expose LOD as fixed distances chosen by an artist. Fixed distances cannot react to the frame budget: on a fast GPU they discard detail that would have been affordable, and on a slow GPU they keep detail that makes the frame miss its target.</w:t>
       </w:r>
     </w:p>
     <w:p>
@@ -339,7 +315,7 @@
           <w:sz w:val="20"/>
           <w:szCs w:val="20"/>
         </w:rPr>
-        <w:t xml:space="preserve">Closed-loop control offers an alternative. Instead of fixing the distances, a controller measures how long the GPU takes and moves one global quality knob up or down [1], [3]. Feedback LOD is an old idea, but open, reproducible measurements of it on vegetation in a freely available engine are scarce, and it is rarely separated from the gain that plain distance LOD already provides.</w:t>
+        <w:t xml:space="preserve">Closed-loop control offers an alternative. Instead of fixing the distances, a controller measures how long the GPU takes and moves one global quality knob up or down [15], [16]. Feedback LOD is an old idea [17] and PI/PID control is standard engineering practice [18], but open, reproducible measurements of it on vegetation in a freely available engine are scarce, and it is rarely separated from the gain that plain distance LOD already provides.</w:t>
       </w:r>
     </w:p>
     <w:p>
@@ -400,7 +376,7 @@
           <w:sz w:val="20"/>
           <w:szCs w:val="20"/>
         </w:rPr>
-        <w:t xml:space="preserve">Feedback-driven LOD predates modern GPUs. Funkhouser and Séquin [1] choose object detail each frame to keep a target frame time, and Luebke et al. [2] survey the field. Wong and Wang [3] apply PID control to frame-rate control in interactive rendering, motivated by the observation that plain LOD does not bound frame rate. Our controller follows this line, but acts on distance thresholds of instanced vegetation and is evaluated against a no-LOD reference as well as a fixed-threshold reference.</w:t>
+        <w:t xml:space="preserve">Feedback-driven LOD predates modern GPUs. Funkhouser and Séquin [15] choose object detail each frame to keep a target frame time, Luebke et al. [3] survey the field, and Wimmer and Wonka [16] estimate rendering time so that a frame budget can be met. Wong and Wang [17] apply PID control to frame-rate control in interactive rendering, motivated by the observation that plain LOD does not bound frame rate. Our controller follows this line, using a standard PI design [18], but acts on distance thresholds of instanced vegetation and is evaluated against a no-LOD reference as well as a fixed-threshold reference.</w:t>
       </w:r>
     </w:p>
     <w:p>
@@ -415,7 +391,7 @@
           <w:sz w:val="20"/>
           <w:szCs w:val="20"/>
         </w:rPr>
-        <w:t xml:space="preserve">Table I lists recent work (2020 onward) that is closest to ours. Reported figures are those stated by the authors; hardware, scenes and baselines differ, so they give context rather than a like-for-like ranking. The literature search behind this table was limited and not systematic. Reference [4] uses frame-budget-driven adaptive LOD with progressive meshes; [5] generates trees on the GPU with work graphs and continuous LOD; [6] uses clustered LOD with opacity micromaps for ray-traced foliage; [7] adapts LOD updates using CPU usage and spatial hashing; and [8] refines terrain adaptively on the GPU.</w:t>
+        <w:t xml:space="preserve">Table I lists recent work (2020 onward) that is closest to ours. Reported figures are those stated by the authors; hardware, scenes and baselines differ, so they give context rather than a like-for-like ranking. The literature search behind this table was limited and not systematic. Reference [19] uses frame-budget-driven adaptive LOD with progressive meshes; [20] generates trees on the GPU with work graphs and continuous LOD; [21] uses clustered LOD with opacity micromaps for ray-traced foliage; [22] adapts LOD updates using CPU usage and spatial hashing; and [23] refines terrain adaptively on the GPU.</w:t>
       </w:r>
     </w:p>
     <w:p>
@@ -612,7 +588,7 @@
                 <w:sz w:val="16"/>
                 <w:szCs w:val="16"/>
               </w:rPr>
-              <w:t xml:space="preserve">Adaptive LOD, VR interiors, 2026 [4]</w:t>
+              <w:t xml:space="preserve">Adaptive LOD, VR interiors, 2026 [19]</w:t>
             </w:r>
           </w:p>
         </w:tc>
@@ -719,7 +695,7 @@
                 <w:sz w:val="16"/>
                 <w:szCs w:val="16"/>
               </w:rPr>
-              <w:t xml:space="preserve">GPU tree generation, HPG 2025 [5]</w:t>
+              <w:t xml:space="preserve">GPU tree generation, HPG 2025 [20]</w:t>
             </w:r>
           </w:p>
         </w:tc>
@@ -826,7 +802,7 @@
                 <w:sz w:val="16"/>
                 <w:szCs w:val="16"/>
               </w:rPr>
-              <w:t xml:space="preserve">Foliage path tracing, ACM [6]</w:t>
+              <w:t xml:space="preserve">Foliage path tracing, ACM [21]</w:t>
             </w:r>
           </w:p>
         </w:tc>
@@ -933,7 +909,7 @@
                 <w:sz w:val="16"/>
                 <w:szCs w:val="16"/>
               </w:rPr>
-              <w:t xml:space="preserve">CPU-usage LOD, 2024 [7]</w:t>
+              <w:t xml:space="preserve">CPU-usage LOD, 2024 [22]</w:t>
             </w:r>
           </w:p>
         </w:tc>
@@ -1040,7 +1016,7 @@
                 <w:sz w:val="16"/>
                 <w:szCs w:val="16"/>
               </w:rPr>
-              <w:t xml:space="preserve">Concurrent binary trees, 2020 [8]</w:t>
+              <w:t xml:space="preserve">Concurrent binary trees, 2020 [23]</w:t>
             </w:r>
           </w:p>
         </w:tc>
@@ -1131,7 +1107,7 @@
           <w:sz w:val="20"/>
           <w:szCs w:val="20"/>
         </w:rPr>
-        <w:t xml:space="preserve">Two observations follow. First, the closest work in intent [4] reports its gain against full-resolution rendering, as we do against None; our reductions (Section V) are larger in magnitude, but our scene, hardware and baseline are different and most of our gain comes from distance LOD itself rather than from the controller. Second, in our limited search we found no published result that isolates the effect of a feedback controller from that of the underlying distance LOD for vegetation, which is what our three-mode protocol is designed to do.</w:t>
+        <w:t xml:space="preserve">Two observations follow. First, the closest work in intent [19] reports its gain against full-resolution rendering, as we do against None; our reductions (Section V) are larger in magnitude, but our scene, hardware and baseline are different and most of our gain comes from distance LOD itself rather than from the controller. Second, in our limited search we found no published result that isolates the effect of a feedback controller from that of the underlying distance LOD for vegetation, which is what our three-mode protocol is designed to do.</w:t>
       </w:r>
     </w:p>
     <w:p>
@@ -1162,7 +1138,7 @@
           <w:sz w:val="20"/>
           <w:szCs w:val="20"/>
         </w:rPr>
-        <w:t xml:space="preserve">The system is written in GDScript for Godot 4.7.2 [9] on top of Terrain3D 1.0.2 [10]; Terrain3D’s own LOD is never modified. A single node, LodManager, switches between three modes: None (all policies disabled, baked vegetation restored), Baseline (the four distance policies with fixed thresholds) and Adaptive (the same policies with thresholds scaled by one controlled bias). Fig. 1 shows the adaptive pipeline.</w:t>
+        <w:t xml:space="preserve">The system is written in GDScript for Godot 4.7.2 [24] on top of Terrain3D 1.0.2 [25]; Terrain3D’s own LOD is never modified. A single node, LodManager, switches between three modes: None (all policies disabled, baked vegetation restored), Baseline (the four distance policies with fixed thresholds) and Adaptive (the same policies with thresholds scaled by one controlled bias). Fig. 1 shows the adaptive pipeline.</w:t>
       </w:r>
     </w:p>
     <w:p>
@@ -8670,7 +8646,7 @@
           <w:sz w:val="20"/>
           <w:szCs w:val="20"/>
         </w:rPr>
-        <w:t xml:space="preserve">The CPU-usage-driven LOD of [7] is the closest in aim. Its gains resemble our Baseline-to-Adaptive step more than our None-to-Adaptive step, because it adapts an existing LOD rather than adding one, although its reference configuration is not stated here. Measured that way, its FPS gains (+36.2% and +20.7%) and triangle reductions (15.79% and 25%) are larger than ours (+0.2% and +2.4% FPS; 0.2% and 8% fewer primitives at 1080p and 1440p). The difference fits the workloads: its signal is CPU usage in what appear to be CPU-bound areas, while ours is GPU render time in a GPU-bound scene, where fewer primitives buy little GPU time and the controller is idle at 1080p. The two signals are complementary, and the two systems were not measured on the same scene or hardware.</w:t>
+        <w:t xml:space="preserve">The CPU-usage-driven LOD of [22] is the closest in aim. Its gains resemble our Baseline-to-Adaptive step more than our None-to-Adaptive step, because it adapts an existing LOD rather than adding one, although its reference configuration is not stated here. Measured that way, its FPS gains (+36.2% and +20.7%) and triangle reductions (15.79% and 25%) are larger than ours (+0.2% and +2.4% FPS; 0.2% and 8% fewer primitives at 1080p and 1440p). The difference fits the workloads: its signal is CPU usage in what appear to be CPU-bound areas, while ours is GPU render time in a GPU-bound scene, where fewer primitives buy little GPU time and the controller is idle at 1080p. The two signals are complementary, and the two systems were not measured on the same scene or hardware.</w:t>
       </w:r>
     </w:p>
     <w:p>
@@ -8955,7 +8931,7 @@
           <w:sz w:val="16"/>
           <w:szCs w:val="16"/>
         </w:rPr>
-        <w:t xml:space="preserve">[1]	T. A. Funkhouser and C. H. Séquin, “Adaptive display algorithm for interactive frame rates during visualization of complex virtual environments,” in Proc. ACM SIGGRAPH, 1993.</w:t>
+        <w:t xml:space="preserve">[1]	J. H. Clark, “Hierarchical geometric models for visible surface algorithms,” Commun. ACM, vol. 19, no. 10, pp. 547–554, 1976.</w:t>
       </w:r>
     </w:p>
     <w:p>
@@ -8973,7 +8949,7 @@
           <w:sz w:val="16"/>
           <w:szCs w:val="16"/>
         </w:rPr>
-        <w:t xml:space="preserve">[2]	D. Luebke, M. Reddy, J. D. Cohen, A. Varshney, B. Watson, and R. Huebner, Level of Detail for 3D Graphics. San Francisco, CA, USA: Morgan Kaufmann, 2003.</w:t>
+        <w:t xml:space="preserve">[2]	J. Rossignac and P. Borrel, “Multi-resolution 3D approximations for rendering complex scenes,” in Modeling in Computer Graphics. Berlin, Germany: Springer, 1993, pp. 455–465.</w:t>
       </w:r>
     </w:p>
     <w:p>
@@ -8991,7 +8967,7 @@
           <w:sz w:val="16"/>
           <w:szCs w:val="16"/>
         </w:rPr>
-        <w:t xml:space="preserve">[3]	Wong and Wang, “Interactive rendering of dynamic environment using PID control,” Eurographics short paper, 2006.</w:t>
+        <w:t xml:space="preserve">[3]	D. Luebke, M. Reddy, J. D. Cohen, A. Varshney, B. Watson, and R. Huebner, Level of Detail for 3D Graphics. San Francisco, CA, USA: Morgan Kaufmann, 2003.</w:t>
       </w:r>
     </w:p>
     <w:p>
@@ -9009,7 +8985,7 @@
           <w:sz w:val="16"/>
           <w:szCs w:val="16"/>
         </w:rPr>
-        <w:t xml:space="preserve">[4]	“Adaptive LOD: progressive mesh control for stable real-time rendering in VR interior design,” The Visual Computer, 2026, doi: 10.1007/s00371-026-04784-5.</w:t>
+        <w:t xml:space="preserve">[4]	T. Akenine-Möller, E. Haines, and N. Hoffman, Real-Time Rendering, 4th ed. Boca Raton, FL, USA: CRC Press, 2018.</w:t>
       </w:r>
     </w:p>
     <w:p>
@@ -9027,7 +9003,7 @@
           <w:sz w:val="16"/>
           <w:szCs w:val="16"/>
         </w:rPr>
-        <w:t xml:space="preserve">[5]	“Real-time GPU tree generation,” in High-Performance Graphics, 2025, doi: 10.2312/hpg.20251168.</w:t>
+        <w:t xml:space="preserve">[5]	H. Hoppe, “Progressive meshes,” in Proc. ACM SIGGRAPH, 1996, pp. 99–108.</w:t>
       </w:r>
     </w:p>
     <w:p>
@@ -9045,7 +9021,7 @@
           <w:sz w:val="16"/>
           <w:szCs w:val="16"/>
         </w:rPr>
-        <w:t xml:space="preserve">[6]	“Real-time path tracing of massive dynamic foliage,” ACM, doi: 10.1145/3820021.</w:t>
+        <w:t xml:space="preserve">[6]	J. Cohen et al., “Simplification envelopes,” in Proc. ACM SIGGRAPH, 1996, pp. 119–128.</w:t>
       </w:r>
     </w:p>
     <w:p>
@@ -9063,7 +9039,7 @@
           <w:sz w:val="16"/>
           <w:szCs w:val="16"/>
         </w:rPr>
-        <w:t xml:space="preserve">[7]	Joubjang and Rakthanmanon, “Automatic level of detail for improved rendering by CPU usage,” in RSU Int. Research Conf., 2024.</w:t>
+        <w:t xml:space="preserve">[7]	M. Garland and P. S. Heckbert, “Surface simplification using quadric error metrics,” in Proc. ACM SIGGRAPH, 1997, pp. 209–216.</w:t>
       </w:r>
     </w:p>
     <w:p>
@@ -9081,7 +9057,7 @@
           <w:sz w:val="16"/>
           <w:szCs w:val="16"/>
         </w:rPr>
-        <w:t xml:space="preserve">[8]	J. Dupuy et al., “Concurrent binary trees (with application to longest edge bisection),” Proc. ACM Comput. Graph. Interact. Tech., 2020, doi: 10.1145/3406186.</w:t>
+        <w:t xml:space="preserve">[8]	O. Deussen et al., “Realistic modeling and rendering of plant ecosystems,” in Proc. ACM SIGGRAPH, 1998, pp. 275–286.</w:t>
       </w:r>
     </w:p>
     <w:p>
@@ -9099,7 +9075,7 @@
           <w:sz w:val="16"/>
           <w:szCs w:val="16"/>
         </w:rPr>
-        <w:t xml:space="preserve">[9]	Godot Engine, version 4.7.2-stable. [Online]. Available: https://godotengine.org</w:t>
+        <w:t xml:space="preserve">[9]	X. Décoret, F. Durand, F. X. Sillion, and J. Dorsey, “Billboard clouds for extreme model simplification,” ACM Trans. Graph., vol. 22, no. 3, 2003.</w:t>
       </w:r>
     </w:p>
     <w:p>
@@ -9117,7 +9093,277 @@
           <w:sz w:val="16"/>
           <w:szCs w:val="16"/>
         </w:rPr>
-        <w:t xml:space="preserve">[10]	Terrain3D, version 1.0.2, Godot terrain plugin.</w:t>
+        <w:t xml:space="preserve">[10]	P. Decaudin and F. Neyret, “Rendering forest scenes in real-time,” in Proc. Eurographics Symp. Rendering, 2004.</w:t>
+      </w:r>
+    </w:p>
+    <w:p>
+      <w:pPr>
+        <w:tabs>
+          <w:tab w:val="left" w:pos="360"/>
+        </w:tabs>
+        <w:spacing w:after="20" w:line="200"/>
+        <w:ind w:left="360" w:hanging="360"/>
+        <w:jc w:val="both"/>
+      </w:pPr>
+      <w:r>
+        <w:rPr>
+          <w:rFonts w:ascii="Times New Roman" w:cs="Times New Roman" w:eastAsia="Times New Roman" w:hAnsi="Times New Roman"/>
+          <w:sz w:val="16"/>
+          <w:szCs w:val="16"/>
+        </w:rPr>
+        <w:t xml:space="preserve">[11]	K. Pelzer, “Rendering countless blades of waving grass,” in GPU Gems, R. Fernando, Ed. Boston, MA, USA: Addison-Wesley, 2004, ch. 7.</w:t>
+      </w:r>
+    </w:p>
+    <w:p>
+      <w:pPr>
+        <w:tabs>
+          <w:tab w:val="left" w:pos="360"/>
+        </w:tabs>
+        <w:spacing w:after="20" w:line="200"/>
+        <w:ind w:left="360" w:hanging="360"/>
+        <w:jc w:val="both"/>
+      </w:pPr>
+      <w:r>
+        <w:rPr>
+          <w:rFonts w:ascii="Times New Roman" w:cs="Times New Roman" w:eastAsia="Times New Roman" w:hAnsi="Times New Roman"/>
+          <w:sz w:val="16"/>
+          <w:szCs w:val="16"/>
+        </w:rPr>
+        <w:t xml:space="preserve">[12]	E. Bruneton and F. Neyret, “Real-time realistic rendering and lighting of forests,” Comput. Graph. Forum, vol. 31, no. 2, 2012.</w:t>
+      </w:r>
+    </w:p>
+    <w:p>
+      <w:pPr>
+        <w:tabs>
+          <w:tab w:val="left" w:pos="360"/>
+        </w:tabs>
+        <w:spacing w:after="20" w:line="200"/>
+        <w:ind w:left="360" w:hanging="360"/>
+        <w:jc w:val="both"/>
+      </w:pPr>
+      <w:r>
+        <w:rPr>
+          <w:rFonts w:ascii="Times New Roman" w:cs="Times New Roman" w:eastAsia="Times New Roman" w:hAnsi="Times New Roman"/>
+          <w:sz w:val="16"/>
+          <w:szCs w:val="16"/>
+        </w:rPr>
+        <w:t xml:space="preserve">[13]	P. Lindstrom et al., “Real-time, continuous level of detail rendering of height fields,” in Proc. ACM SIGGRAPH, 1996, pp. 109–118.</w:t>
+      </w:r>
+    </w:p>
+    <w:p>
+      <w:pPr>
+        <w:tabs>
+          <w:tab w:val="left" w:pos="360"/>
+        </w:tabs>
+        <w:spacing w:after="20" w:line="200"/>
+        <w:ind w:left="360" w:hanging="360"/>
+        <w:jc w:val="both"/>
+      </w:pPr>
+      <w:r>
+        <w:rPr>
+          <w:rFonts w:ascii="Times New Roman" w:cs="Times New Roman" w:eastAsia="Times New Roman" w:hAnsi="Times New Roman"/>
+          <w:sz w:val="16"/>
+          <w:szCs w:val="16"/>
+        </w:rPr>
+        <w:t xml:space="preserve">[14]	B. Karis, R. Stubbe, and G. Wihlidal, “A deep dive into Nanite virtualized geometry,” in ACM SIGGRAPH Advances in Real-Time Rendering in Games course, 2021.</w:t>
+      </w:r>
+    </w:p>
+    <w:p>
+      <w:pPr>
+        <w:tabs>
+          <w:tab w:val="left" w:pos="360"/>
+        </w:tabs>
+        <w:spacing w:after="20" w:line="200"/>
+        <w:ind w:left="360" w:hanging="360"/>
+        <w:jc w:val="both"/>
+      </w:pPr>
+      <w:r>
+        <w:rPr>
+          <w:rFonts w:ascii="Times New Roman" w:cs="Times New Roman" w:eastAsia="Times New Roman" w:hAnsi="Times New Roman"/>
+          <w:sz w:val="16"/>
+          <w:szCs w:val="16"/>
+        </w:rPr>
+        <w:t xml:space="preserve">[15]	T. A. Funkhouser and C. H. Séquin, “Adaptive display algorithm for interactive frame rates during visualization of complex virtual environments,” in Proc. ACM SIGGRAPH, 1993.</w:t>
+      </w:r>
+    </w:p>
+    <w:p>
+      <w:pPr>
+        <w:tabs>
+          <w:tab w:val="left" w:pos="360"/>
+        </w:tabs>
+        <w:spacing w:after="20" w:line="200"/>
+        <w:ind w:left="360" w:hanging="360"/>
+        <w:jc w:val="both"/>
+      </w:pPr>
+      <w:r>
+        <w:rPr>
+          <w:rFonts w:ascii="Times New Roman" w:cs="Times New Roman" w:eastAsia="Times New Roman" w:hAnsi="Times New Roman"/>
+          <w:sz w:val="16"/>
+          <w:szCs w:val="16"/>
+        </w:rPr>
+        <w:t xml:space="preserve">[16]	M. Wimmer and P. Wonka, “Rendering time estimation for real-time rendering,” in Proc. Eurographics Workshop Rendering, 2003.</w:t>
+      </w:r>
+    </w:p>
+    <w:p>
+      <w:pPr>
+        <w:tabs>
+          <w:tab w:val="left" w:pos="360"/>
+        </w:tabs>
+        <w:spacing w:after="20" w:line="200"/>
+        <w:ind w:left="360" w:hanging="360"/>
+        <w:jc w:val="both"/>
+      </w:pPr>
+      <w:r>
+        <w:rPr>
+          <w:rFonts w:ascii="Times New Roman" w:cs="Times New Roman" w:eastAsia="Times New Roman" w:hAnsi="Times New Roman"/>
+          <w:sz w:val="16"/>
+          <w:szCs w:val="16"/>
+        </w:rPr>
+        <w:t xml:space="preserve">[17]	Wong and Wang, “Interactive rendering of dynamic environment using PID control,” Eurographics short paper, 2006.</w:t>
+      </w:r>
+    </w:p>
+    <w:p>
+      <w:pPr>
+        <w:tabs>
+          <w:tab w:val="left" w:pos="360"/>
+        </w:tabs>
+        <w:spacing w:after="20" w:line="200"/>
+        <w:ind w:left="360" w:hanging="360"/>
+        <w:jc w:val="both"/>
+      </w:pPr>
+      <w:r>
+        <w:rPr>
+          <w:rFonts w:ascii="Times New Roman" w:cs="Times New Roman" w:eastAsia="Times New Roman" w:hAnsi="Times New Roman"/>
+          <w:sz w:val="16"/>
+          <w:szCs w:val="16"/>
+        </w:rPr>
+        <w:t xml:space="preserve">[18]	K. J. Åström and T. Hägglund, PID Controllers: Theory, Design, and Tuning, 2nd ed. Research Triangle Park, NC, USA: ISA, 1995.</w:t>
+      </w:r>
+    </w:p>
+    <w:p>
+      <w:pPr>
+        <w:tabs>
+          <w:tab w:val="left" w:pos="360"/>
+        </w:tabs>
+        <w:spacing w:after="20" w:line="200"/>
+        <w:ind w:left="360" w:hanging="360"/>
+        <w:jc w:val="both"/>
+      </w:pPr>
+      <w:r>
+        <w:rPr>
+          <w:rFonts w:ascii="Times New Roman" w:cs="Times New Roman" w:eastAsia="Times New Roman" w:hAnsi="Times New Roman"/>
+          <w:sz w:val="16"/>
+          <w:szCs w:val="16"/>
+        </w:rPr>
+        <w:t xml:space="preserve">[19]	“Adaptive LOD: progressive mesh control for stable real-time rendering in VR interior design,” The Visual Computer, 2026, doi: 10.1007/s00371-026-04784-5.</w:t>
+      </w:r>
+    </w:p>
+    <w:p>
+      <w:pPr>
+        <w:tabs>
+          <w:tab w:val="left" w:pos="360"/>
+        </w:tabs>
+        <w:spacing w:after="20" w:line="200"/>
+        <w:ind w:left="360" w:hanging="360"/>
+        <w:jc w:val="both"/>
+      </w:pPr>
+      <w:r>
+        <w:rPr>
+          <w:rFonts w:ascii="Times New Roman" w:cs="Times New Roman" w:eastAsia="Times New Roman" w:hAnsi="Times New Roman"/>
+          <w:sz w:val="16"/>
+          <w:szCs w:val="16"/>
+        </w:rPr>
+        <w:t xml:space="preserve">[20]	“Real-time GPU tree generation,” in High-Performance Graphics, 2025, doi: 10.2312/hpg.20251168.</w:t>
+      </w:r>
+    </w:p>
+    <w:p>
+      <w:pPr>
+        <w:tabs>
+          <w:tab w:val="left" w:pos="360"/>
+        </w:tabs>
+        <w:spacing w:after="20" w:line="200"/>
+        <w:ind w:left="360" w:hanging="360"/>
+        <w:jc w:val="both"/>
+      </w:pPr>
+      <w:r>
+        <w:rPr>
+          <w:rFonts w:ascii="Times New Roman" w:cs="Times New Roman" w:eastAsia="Times New Roman" w:hAnsi="Times New Roman"/>
+          <w:sz w:val="16"/>
+          <w:szCs w:val="16"/>
+        </w:rPr>
+        <w:t xml:space="preserve">[21]	“Real-time path tracing of massive dynamic foliage,” ACM, doi: 10.1145/3820021.</w:t>
+      </w:r>
+    </w:p>
+    <w:p>
+      <w:pPr>
+        <w:tabs>
+          <w:tab w:val="left" w:pos="360"/>
+        </w:tabs>
+        <w:spacing w:after="20" w:line="200"/>
+        <w:ind w:left="360" w:hanging="360"/>
+        <w:jc w:val="both"/>
+      </w:pPr>
+      <w:r>
+        <w:rPr>
+          <w:rFonts w:ascii="Times New Roman" w:cs="Times New Roman" w:eastAsia="Times New Roman" w:hAnsi="Times New Roman"/>
+          <w:sz w:val="16"/>
+          <w:szCs w:val="16"/>
+        </w:rPr>
+        <w:t xml:space="preserve">[22]	Joubjang and Rakthanmanon, “Automatic level of detail for improved rendering by CPU usage,” in RSU Int. Research Conf., 2024.</w:t>
+      </w:r>
+    </w:p>
+    <w:p>
+      <w:pPr>
+        <w:tabs>
+          <w:tab w:val="left" w:pos="360"/>
+        </w:tabs>
+        <w:spacing w:after="20" w:line="200"/>
+        <w:ind w:left="360" w:hanging="360"/>
+        <w:jc w:val="both"/>
+      </w:pPr>
+      <w:r>
+        <w:rPr>
+          <w:rFonts w:ascii="Times New Roman" w:cs="Times New Roman" w:eastAsia="Times New Roman" w:hAnsi="Times New Roman"/>
+          <w:sz w:val="16"/>
+          <w:szCs w:val="16"/>
+        </w:rPr>
+        <w:t xml:space="preserve">[23]	J. Dupuy et al., “Concurrent binary trees (with application to longest edge bisection),” Proc. ACM Comput. Graph. Interact. Tech., 2020, doi: 10.1145/3406186.</w:t>
+      </w:r>
+    </w:p>
+    <w:p>
+      <w:pPr>
+        <w:tabs>
+          <w:tab w:val="left" w:pos="360"/>
+        </w:tabs>
+        <w:spacing w:after="20" w:line="200"/>
+        <w:ind w:left="360" w:hanging="360"/>
+        <w:jc w:val="both"/>
+      </w:pPr>
+      <w:r>
+        <w:rPr>
+          <w:rFonts w:ascii="Times New Roman" w:cs="Times New Roman" w:eastAsia="Times New Roman" w:hAnsi="Times New Roman"/>
+          <w:sz w:val="16"/>
+          <w:szCs w:val="16"/>
+        </w:rPr>
+        <w:t xml:space="preserve">[24]	Godot Engine, version 4.7.2-stable. [Online]. Available: https://godotengine.org</w:t>
+      </w:r>
+    </w:p>
+    <w:p>
+      <w:pPr>
+        <w:tabs>
+          <w:tab w:val="left" w:pos="360"/>
+        </w:tabs>
+        <w:spacing w:after="20" w:line="200"/>
+        <w:ind w:left="360" w:hanging="360"/>
+        <w:jc w:val="both"/>
+      </w:pPr>
+      <w:r>
+        <w:rPr>
+          <w:rFonts w:ascii="Times New Roman" w:cs="Times New Roman" w:eastAsia="Times New Roman" w:hAnsi="Times New Roman"/>
+          <w:sz w:val="16"/>
+          <w:szCs w:val="16"/>
+        </w:rPr>
+        <w:t xml:space="preserve">[25]	Terrain3D, version 1.0.2, Godot terrain plugin.</w:t>
       </w:r>
     </w:p>
     <w:sectPr>

</xml_diff>